<commit_message>
Panel más fácil de usar: guía rápida, textos simples y ayudas
</commit_message>
<xml_diff>
--- a/docs/informes/Informe_Semana_3_Panel.docx
+++ b/docs/informes/Informe_Semana_3_Panel.docx
@@ -1261,7 +1261,23 @@
           <w:rFonts w:ascii="Arial" w:cs="Arial" w:eastAsia="Arial" w:hAnsi="Arial"/>
           <w:color w:val="26232F"/>
         </w:rPr>
-        <w:t xml:space="preserve">El dashboard muestra tarjetas con los totales (páginas, bloques, ítems de menú y mensajes sin leer), la lista de páginas y una vista previa de los colores actuales del sitio.</w:t>
+        <w:t xml:space="preserve">El dashboard empieza con una </w:t>
+      </w:r>
+      <w:r>
+        <w:rPr>
+          <w:rFonts w:ascii="Arial" w:cs="Arial" w:eastAsia="Arial" w:hAnsi="Arial"/>
+          <w:b/>
+          <w:bCs/>
+          <w:color w:val="26232F"/>
+        </w:rPr>
+        <w:t xml:space="preserve">guía rápida “¿Por dónde empiezo?”</w:t>
+      </w:r>
+      <w:r>
+        <w:rPr>
+          <w:rFonts w:ascii="Arial" w:cs="Arial" w:eastAsia="Arial" w:hAnsi="Arial"/>
+          <w:color w:val="26232F"/>
+        </w:rPr>
+        <w:t xml:space="preserve"> de 4 pasos (cambiar colores y logo, editar la portada, ordenar el menú y ver la web), cada uno con un enlace directo. Debajo hay tarjetas con los totales (páginas, bloques, ítems de menú y mensajes sin leer), la lista de páginas y una vista previa de los colores actuales del sitio.</w:t>
       </w:r>
     </w:p>
     <w:p>
@@ -1318,7 +1334,7 @@
                 <wp:inline distT="0" distB="0" distL="0" distR="0">
                   <wp:extent cx="5048250" cy="3429000"/>
                   <wp:effectExtent t="0" r="0" b="0" l="0"/>
-                  <wp:docPr id="1" name="fig3" descr="Dashboard con menú lateral, tarjetas de totales y vista previa de colores." title="Dashboard con menú lateral, tarjetas de totales y vista previa de colores."/>
+                  <wp:docPr id="1" name="fig3" descr="Dashboard con la guía rápida, tarjetas de totales y vista previa de colores." title="Dashboard con la guía rápida, tarjetas de totales y vista previa de colores."/>
                   <wp:cNvGraphicFramePr>
                     <a:graphicFrameLocks xmlns:a="http://schemas.openxmlformats.org/drawingml/2006/main" noChangeAspect="1"/>
                   </wp:cNvGraphicFramePr>
@@ -1378,7 +1394,7 @@
                 <w:sz w:val="17"/>
                 <w:szCs w:val="17"/>
               </w:rPr>
-              <w:t xml:space="preserve">Dashboard con menú lateral, tarjetas de totales y vista previa de colores.</w:t>
+              <w:t xml:space="preserve">Dashboard con la guía rápida, tarjetas de totales y vista previa de colores.</w:t>
             </w:r>
           </w:p>
         </w:tc>
@@ -2007,7 +2023,7 @@
                 <wp:inline distT="0" distB="0" distL="0" distR="0">
                   <wp:extent cx="5048250" cy="3429000"/>
                   <wp:effectExtent t="0" r="0" b="0" l="0"/>
-                  <wp:docPr id="1" name="fig8" descr="Pestaña JSON para editar el contenido directamente." title="Pestaña JSON para editar el contenido directamente."/>
+                  <wp:docPr id="1" name="fig8" descr="Pestaña “Avanzado (JSON)” para usuarios que quieran editar el contenido directamente." title="Pestaña “Avanzado (JSON)” para usuarios que quieran editar el contenido directamente."/>
                   <wp:cNvGraphicFramePr>
                     <a:graphicFrameLocks xmlns:a="http://schemas.openxmlformats.org/drawingml/2006/main" noChangeAspect="1"/>
                   </wp:cNvGraphicFramePr>
@@ -2067,7 +2083,7 @@
                 <w:sz w:val="17"/>
                 <w:szCs w:val="17"/>
               </w:rPr>
-              <w:t xml:space="preserve">Pestaña JSON para editar el contenido directamente.</w:t>
+              <w:t xml:space="preserve">Pestaña “Avanzado (JSON)” para usuarios que quieran editar el contenido directamente.</w:t>
             </w:r>
           </w:p>
         </w:tc>
@@ -3592,6 +3608,463 @@
     </w:p>
     <w:p>
       <w:pPr>
+        <w:pStyle w:val="Heading2"/>
+        <w:pBdr>
+          <w:left w:val="single" w:color="6D28D9" w:sz="24" w:space="8"/>
+        </w:pBdr>
+        <w:ind w:left="180"/>
+      </w:pPr>
+      <w:r>
+        <w:rPr>
+          <w:rFonts w:ascii="Arial" w:cs="Arial" w:eastAsia="Arial" w:hAnsi="Arial"/>
+          <w:color w:val="6D28D9"/>
+        </w:rPr>
+        <w:t xml:space="preserve">3.10  </w:t>
+      </w:r>
+      <w:r>
+        <w:rPr>
+          <w:rFonts w:ascii="Arial" w:cs="Arial" w:eastAsia="Arial" w:hAnsi="Arial"/>
+        </w:rPr>
+        <w:t xml:space="preserve">Pensado para que lo use cualquier persona</w:t>
+      </w:r>
+    </w:p>
+    <w:p>
+      <w:pPr>
+        <w:spacing w:after="160" w:line="310"/>
+        <w:jc w:val="both"/>
+      </w:pPr>
+      <w:r>
+        <w:rPr>
+          <w:rFonts w:ascii="Arial" w:cs="Arial" w:eastAsia="Arial" w:hAnsi="Arial"/>
+          <w:color w:val="26232F"/>
+        </w:rPr>
+        <w:t xml:space="preserve">Como el objetivo del proyecto es que alguien </w:t>
+      </w:r>
+      <w:r>
+        <w:rPr>
+          <w:rFonts w:ascii="Arial" w:cs="Arial" w:eastAsia="Arial" w:hAnsi="Arial"/>
+          <w:b/>
+          <w:bCs/>
+          <w:color w:val="26232F"/>
+        </w:rPr>
+        <w:t xml:space="preserve">sin conocimientos de programación</w:t>
+      </w:r>
+      <w:r>
+        <w:rPr>
+          <w:rFonts w:ascii="Arial" w:cs="Arial" w:eastAsia="Arial" w:hAnsi="Arial"/>
+          <w:color w:val="26232F"/>
+        </w:rPr>
+        <w:t xml:space="preserve"> maneje la web, revisé el panel poniéndome en el lugar del dueño de un negocio y cambié todo lo que sonaba técnico:</w:t>
+      </w:r>
+    </w:p>
+    <w:p>
+      <w:pPr>
+        <w:pStyle w:val="ListParagraph"/>
+        <w:numPr>
+          <w:ilvl w:val="0"/>
+          <w:numId w:val="2"/>
+        </w:numPr>
+        <w:spacing w:after="90" w:line="300"/>
+      </w:pPr>
+      <w:r>
+        <w:rPr>
+          <w:rFonts w:ascii="Arial" w:cs="Arial" w:eastAsia="Arial" w:hAnsi="Arial"/>
+          <w:b/>
+          <w:bCs/>
+          <w:color w:val="26232F"/>
+        </w:rPr>
+        <w:t xml:space="preserve">Textos en lenguaje simple:</w:t>
+      </w:r>
+      <w:r>
+        <w:rPr>
+          <w:rFonts w:ascii="Arial" w:cs="Arial" w:eastAsia="Arial" w:hAnsi="Arial"/>
+          <w:color w:val="26232F"/>
+        </w:rPr>
+        <w:t xml:space="preserve"> cada sección explica arriba para qué sirve (por ejemplo, “Sube aquí las fotos de tu web. Después las eliges desde cada bloque”). Quité las rutas de la API que aparecían en el panel lateral y los nombres internos de los bloques: ahora dice “Portada” en vez de “hero”.</w:t>
+      </w:r>
+    </w:p>
+    <w:p>
+      <w:pPr>
+        <w:pStyle w:val="ListParagraph"/>
+        <w:numPr>
+          <w:ilvl w:val="0"/>
+          <w:numId w:val="2"/>
+        </w:numPr>
+        <w:spacing w:after="90" w:line="300"/>
+      </w:pPr>
+      <w:r>
+        <w:rPr>
+          <w:rFonts w:ascii="Arial" w:cs="Arial" w:eastAsia="Arial" w:hAnsi="Arial"/>
+          <w:b/>
+          <w:bCs/>
+          <w:color w:val="26232F"/>
+        </w:rPr>
+        <w:t xml:space="preserve">Botones con texto:</w:t>
+      </w:r>
+      <w:r>
+        <w:rPr>
+          <w:rFonts w:ascii="Arial" w:cs="Arial" w:eastAsia="Arial" w:hAnsi="Arial"/>
+          <w:color w:val="26232F"/>
+        </w:rPr>
+        <w:t xml:space="preserve"> las acciones principales dicen lo que hacen (“Contenido”, “Editar”, “Agregar bloque”, “Guardar cambios”). Los botones que solo tienen ícono (subir, bajar, borrar) muestran un texto al pasar el mouse, y borrar siempre pide confirmación.</w:t>
+      </w:r>
+    </w:p>
+    <w:p>
+      <w:pPr>
+        <w:pStyle w:val="ListParagraph"/>
+        <w:numPr>
+          <w:ilvl w:val="0"/>
+          <w:numId w:val="2"/>
+        </w:numPr>
+        <w:spacing w:after="90" w:line="300"/>
+      </w:pPr>
+      <w:r>
+        <w:rPr>
+          <w:rFonts w:ascii="Arial" w:cs="Arial" w:eastAsia="Arial" w:hAnsi="Arial"/>
+          <w:b/>
+          <w:bCs/>
+          <w:color w:val="26232F"/>
+        </w:rPr>
+        <w:t xml:space="preserve">Para qué sirve cada color:</w:t>
+      </w:r>
+      <w:r>
+        <w:rPr>
+          <w:rFonts w:ascii="Arial" w:cs="Arial" w:eastAsia="Arial" w:hAnsi="Arial"/>
+          <w:color w:val="26232F"/>
+        </w:rPr>
+        <w:t xml:space="preserve"> debajo de cada selector dice dónde se usa en la web (por ejemplo, Acento: “Botones principales y cinta animada”), junto con un consejo sobre el contraste entre el fondo y el texto.</w:t>
+      </w:r>
+    </w:p>
+    <w:p>
+      <w:pPr>
+        <w:pStyle w:val="ListParagraph"/>
+        <w:numPr>
+          <w:ilvl w:val="0"/>
+          <w:numId w:val="2"/>
+        </w:numPr>
+        <w:spacing w:after="90" w:line="300"/>
+      </w:pPr>
+      <w:r>
+        <w:rPr>
+          <w:rFonts w:ascii="Arial" w:cs="Arial" w:eastAsia="Arial" w:hAnsi="Arial"/>
+          <w:b/>
+          <w:bCs/>
+          <w:color w:val="26232F"/>
+        </w:rPr>
+        <w:t xml:space="preserve">Enlaces sin adivinar:</w:t>
+      </w:r>
+      <w:r>
+        <w:rPr>
+          <w:rFonts w:ascii="Arial" w:cs="Arial" w:eastAsia="Arial" w:hAnsi="Arial"/>
+          <w:color w:val="26232F"/>
+        </w:rPr>
+        <w:t xml:space="preserve"> al escribir el enlace de un botón aparece una lista con las páginas del sitio, así no hay que saber la dirección exacta.</w:t>
+      </w:r>
+    </w:p>
+    <w:p>
+      <w:pPr>
+        <w:pStyle w:val="ListParagraph"/>
+        <w:numPr>
+          <w:ilvl w:val="0"/>
+          <w:numId w:val="2"/>
+        </w:numPr>
+        <w:spacing w:after="90" w:line="300"/>
+      </w:pPr>
+      <w:r>
+        <w:rPr>
+          <w:rFonts w:ascii="Arial" w:cs="Arial" w:eastAsia="Arial" w:hAnsi="Arial"/>
+          <w:b/>
+          <w:bCs/>
+          <w:color w:val="26232F"/>
+        </w:rPr>
+        <w:t xml:space="preserve">Lo técnico, aparte:</w:t>
+      </w:r>
+      <w:r>
+        <w:rPr>
+          <w:rFonts w:ascii="Arial" w:cs="Arial" w:eastAsia="Arial" w:hAnsi="Arial"/>
+          <w:color w:val="26232F"/>
+        </w:rPr>
+        <w:t xml:space="preserve"> la edición en JSON quedó en una pestaña “Avanzado (JSON)”, y la dirección de una página se crea sola a partir del título.</w:t>
+      </w:r>
+    </w:p>
+    <w:p>
+      <w:pPr>
+        <w:pStyle w:val="ListParagraph"/>
+        <w:numPr>
+          <w:ilvl w:val="0"/>
+          <w:numId w:val="2"/>
+        </w:numPr>
+        <w:spacing w:after="90" w:line="300"/>
+      </w:pPr>
+      <w:r>
+        <w:rPr>
+          <w:rFonts w:ascii="Arial" w:cs="Arial" w:eastAsia="Arial" w:hAnsi="Arial"/>
+          <w:b/>
+          <w:bCs/>
+          <w:color w:val="26232F"/>
+        </w:rPr>
+        <w:t xml:space="preserve">Guía rápida</w:t>
+      </w:r>
+      <w:r>
+        <w:rPr>
+          <w:rFonts w:ascii="Arial" w:cs="Arial" w:eastAsia="Arial" w:hAnsi="Arial"/>
+          <w:color w:val="26232F"/>
+        </w:rPr>
+        <w:t xml:space="preserve"> en el dashboard y una guía completa del panel en el README.</w:t>
+      </w:r>
+    </w:p>
+    <w:p>
+      <w:pPr>
+        <w:keepNext/>
+        <w:spacing w:after="0" w:before="100"/>
+      </w:pPr>
+    </w:p>
+    <w:tbl>
+      <w:tblPr>
+        <w:tblW w:type="dxa" w:w="9638"/>
+        <w:jc w:val="center"/>
+        <w:tblBorders>
+          <w:top w:val="single" w:color="auto" w:sz="4"/>
+          <w:left w:val="single" w:color="auto" w:sz="4"/>
+          <w:bottom w:val="single" w:color="auto" w:sz="4"/>
+          <w:right w:val="single" w:color="auto" w:sz="4"/>
+          <w:insideH w:val="single" w:color="auto" w:sz="4"/>
+          <w:insideV w:val="single" w:color="auto" w:sz="4"/>
+        </w:tblBorders>
+      </w:tblPr>
+      <w:tblGrid>
+        <w:gridCol w:w="9638"/>
+      </w:tblGrid>
+      <w:tr>
+        <w:trPr>
+          <w:cantSplit/>
+        </w:trPr>
+        <w:tc>
+          <w:tcPr>
+            <w:tcW w:type="dxa" w:w="9638"/>
+            <w:tcBorders>
+              <w:top w:val="single" w:color="DCD3F5" w:sz="4"/>
+              <w:left w:val="single" w:color="DCD3F5" w:sz="4"/>
+              <w:bottom w:val="single" w:color="DCD3F5" w:sz="4"/>
+              <w:right w:val="single" w:color="DCD3F5" w:sz="4"/>
+            </w:tcBorders>
+            <w:shd w:fill="FAF8FF" w:val="clear"/>
+            <w:tcMar>
+              <w:top w:type="dxa" w:w="140"/>
+              <w:left w:type="dxa" w:w="120"/>
+              <w:bottom w:type="dxa" w:w="120"/>
+              <w:right w:type="dxa" w:w="120"/>
+            </w:tcMar>
+          </w:tcPr>
+          <w:p>
+            <w:pPr>
+              <w:keepNext/>
+              <w:spacing w:after="100"/>
+              <w:jc w:val="center"/>
+            </w:pPr>
+            <w:r>
+              <w:drawing>
+                <wp:inline distT="0" distB="0" distL="0" distR="0">
+                  <wp:extent cx="5048250" cy="3429000"/>
+                  <wp:effectExtent t="0" r="0" b="0" l="0"/>
+                  <wp:docPr id="1" name="fig18" descr="Al agregar un bloque, cada opción explica qué sección agrega." title="Al agregar un bloque, cada opción explica qué sección agrega."/>
+                  <wp:cNvGraphicFramePr>
+                    <a:graphicFrameLocks xmlns:a="http://schemas.openxmlformats.org/drawingml/2006/main" noChangeAspect="1"/>
+                  </wp:cNvGraphicFramePr>
+                  <a:graphic xmlns:a="http://schemas.openxmlformats.org/drawingml/2006/main">
+                    <a:graphicData uri="http://schemas.openxmlformats.org/drawingml/2006/picture">
+                      <pic:pic xmlns:pic="http://schemas.openxmlformats.org/drawingml/2006/picture">
+                        <pic:nvPicPr>
+                          <pic:cNvPr id="0" name="" descr=""/>
+                          <pic:cNvPicPr>
+                            <a:picLocks noChangeAspect="1" noChangeArrowheads="1"/>
+                          </pic:cNvPicPr>
+                        </pic:nvPicPr>
+                        <pic:blipFill>
+                          <a:blip r:embed="rId27" cstate="none"/>
+                          <a:srcRect/>
+                          <a:stretch>
+                            <a:fillRect/>
+                          </a:stretch>
+                        </pic:blipFill>
+                        <pic:spPr bwMode="auto">
+                          <a:xfrm>
+                            <a:off x="0" y="0"/>
+                            <a:ext cx="5048250" cy="3429000"/>
+                          </a:xfrm>
+                          <a:prstGeom prst="rect">
+                            <a:avLst/>
+                          </a:prstGeom>
+                        </pic:spPr>
+                      </pic:pic>
+                    </a:graphicData>
+                  </a:graphic>
+                </wp:inline>
+              </w:drawing>
+            </w:r>
+          </w:p>
+          <w:p>
+            <w:pPr>
+              <w:spacing w:after="0"/>
+              <w:jc w:val="center"/>
+            </w:pPr>
+            <w:r>
+              <w:rPr>
+                <w:rFonts w:ascii="Arial" w:cs="Arial" w:eastAsia="Arial" w:hAnsi="Arial"/>
+                <w:b/>
+                <w:bCs/>
+                <w:color w:val="6D28D9"/>
+                <w:spacing w:val="20"/>
+                <w:sz w:val="16"/>
+                <w:szCs w:val="16"/>
+              </w:rPr>
+              <w:t xml:space="preserve">FIGURA 18  </w:t>
+            </w:r>
+            <w:r>
+              <w:rPr>
+                <w:rFonts w:ascii="Arial" w:cs="Arial" w:eastAsia="Arial" w:hAnsi="Arial"/>
+                <w:color w:val="5B5870"/>
+                <w:sz w:val="17"/>
+                <w:szCs w:val="17"/>
+              </w:rPr>
+              <w:t xml:space="preserve">Al agregar un bloque, cada opción explica qué sección agrega.</w:t>
+            </w:r>
+          </w:p>
+        </w:tc>
+      </w:tr>
+    </w:tbl>
+    <w:p>
+      <w:pPr>
+        <w:spacing w:after="160"/>
+      </w:pPr>
+    </w:p>
+    <w:p>
+      <w:pPr>
+        <w:keepNext/>
+        <w:spacing w:after="0" w:before="100"/>
+      </w:pPr>
+    </w:p>
+    <w:tbl>
+      <w:tblPr>
+        <w:tblW w:type="dxa" w:w="9638"/>
+        <w:jc w:val="center"/>
+        <w:tblBorders>
+          <w:top w:val="single" w:color="auto" w:sz="4"/>
+          <w:left w:val="single" w:color="auto" w:sz="4"/>
+          <w:bottom w:val="single" w:color="auto" w:sz="4"/>
+          <w:right w:val="single" w:color="auto" w:sz="4"/>
+          <w:insideH w:val="single" w:color="auto" w:sz="4"/>
+          <w:insideV w:val="single" w:color="auto" w:sz="4"/>
+        </w:tblBorders>
+      </w:tblPr>
+      <w:tblGrid>
+        <w:gridCol w:w="9638"/>
+      </w:tblGrid>
+      <w:tr>
+        <w:trPr>
+          <w:cantSplit/>
+        </w:trPr>
+        <w:tc>
+          <w:tcPr>
+            <w:tcW w:type="dxa" w:w="9638"/>
+            <w:tcBorders>
+              <w:top w:val="single" w:color="DCD3F5" w:sz="4"/>
+              <w:left w:val="single" w:color="DCD3F5" w:sz="4"/>
+              <w:bottom w:val="single" w:color="DCD3F5" w:sz="4"/>
+              <w:right w:val="single" w:color="DCD3F5" w:sz="4"/>
+            </w:tcBorders>
+            <w:shd w:fill="FAF8FF" w:val="clear"/>
+            <w:tcMar>
+              <w:top w:type="dxa" w:w="140"/>
+              <w:left w:type="dxa" w:w="120"/>
+              <w:bottom w:type="dxa" w:w="120"/>
+              <w:right w:type="dxa" w:w="120"/>
+            </w:tcMar>
+          </w:tcPr>
+          <w:p>
+            <w:pPr>
+              <w:keepNext/>
+              <w:spacing w:after="100"/>
+              <w:jc w:val="center"/>
+            </w:pPr>
+            <w:r>
+              <w:drawing>
+                <wp:inline distT="0" distB="0" distL="0" distR="0">
+                  <wp:extent cx="5048250" cy="3429000"/>
+                  <wp:effectExtent t="0" r="0" b="0" l="0"/>
+                  <wp:docPr id="1" name="fig19" descr="Lista de páginas sugeridas al escribir el enlace de un botón." title="Lista de páginas sugeridas al escribir el enlace de un botón."/>
+                  <wp:cNvGraphicFramePr>
+                    <a:graphicFrameLocks xmlns:a="http://schemas.openxmlformats.org/drawingml/2006/main" noChangeAspect="1"/>
+                  </wp:cNvGraphicFramePr>
+                  <a:graphic xmlns:a="http://schemas.openxmlformats.org/drawingml/2006/main">
+                    <a:graphicData uri="http://schemas.openxmlformats.org/drawingml/2006/picture">
+                      <pic:pic xmlns:pic="http://schemas.openxmlformats.org/drawingml/2006/picture">
+                        <pic:nvPicPr>
+                          <pic:cNvPr id="0" name="" descr=""/>
+                          <pic:cNvPicPr>
+                            <a:picLocks noChangeAspect="1" noChangeArrowheads="1"/>
+                          </pic:cNvPicPr>
+                        </pic:nvPicPr>
+                        <pic:blipFill>
+                          <a:blip r:embed="rId28" cstate="none"/>
+                          <a:srcRect/>
+                          <a:stretch>
+                            <a:fillRect/>
+                          </a:stretch>
+                        </pic:blipFill>
+                        <pic:spPr bwMode="auto">
+                          <a:xfrm>
+                            <a:off x="0" y="0"/>
+                            <a:ext cx="5048250" cy="3429000"/>
+                          </a:xfrm>
+                          <a:prstGeom prst="rect">
+                            <a:avLst/>
+                          </a:prstGeom>
+                        </pic:spPr>
+                      </pic:pic>
+                    </a:graphicData>
+                  </a:graphic>
+                </wp:inline>
+              </w:drawing>
+            </w:r>
+          </w:p>
+          <w:p>
+            <w:pPr>
+              <w:spacing w:after="0"/>
+              <w:jc w:val="center"/>
+            </w:pPr>
+            <w:r>
+              <w:rPr>
+                <w:rFonts w:ascii="Arial" w:cs="Arial" w:eastAsia="Arial" w:hAnsi="Arial"/>
+                <w:b/>
+                <w:bCs/>
+                <w:color w:val="6D28D9"/>
+                <w:spacing w:val="20"/>
+                <w:sz w:val="16"/>
+                <w:szCs w:val="16"/>
+              </w:rPr>
+              <w:t xml:space="preserve">FIGURA 19  </w:t>
+            </w:r>
+            <w:r>
+              <w:rPr>
+                <w:rFonts w:ascii="Arial" w:cs="Arial" w:eastAsia="Arial" w:hAnsi="Arial"/>
+                <w:color w:val="5B5870"/>
+                <w:sz w:val="17"/>
+                <w:szCs w:val="17"/>
+              </w:rPr>
+              <w:t xml:space="preserve">Lista de páginas sugeridas al escribir el enlace de un botón.</w:t>
+            </w:r>
+          </w:p>
+        </w:tc>
+      </w:tr>
+    </w:tbl>
+    <w:p>
+      <w:pPr>
+        <w:spacing w:after="160"/>
+      </w:pPr>
+    </w:p>
+    <w:p>
+      <w:pPr>
         <w:pStyle w:val="Heading1"/>
         <w:pBdr>
           <w:bottom w:val="single" w:color="DCD3F5" w:sz="6" w:space="6"/>
@@ -4090,7 +4563,7 @@
                 <w:sz w:val="19"/>
                 <w:szCs w:val="19"/>
               </w:rPr>
-              <w:t xml:space="preserve">JSON con error en la pestaña JSON</w:t>
+              <w:t xml:space="preserve">JSON con error en la pestaña Avanzado</w:t>
             </w:r>
           </w:p>
         </w:tc>
@@ -4195,7 +4668,7 @@
                 <w:sz w:val="19"/>
                 <w:szCs w:val="19"/>
               </w:rPr>
-              <w:t xml:space="preserve">Ocultar y reordenar bloques</w:t>
+              <w:t xml:space="preserve">Usuario nuevo sigue la guía rápida</w:t>
             </w:r>
           </w:p>
         </w:tc>
@@ -4227,7 +4700,7 @@
                 <w:sz w:val="19"/>
                 <w:szCs w:val="19"/>
               </w:rPr>
-              <w:t xml:space="preserve">Cambia el orden en la web</w:t>
+              <w:t xml:space="preserve">Llega a cada sección con un clic</w:t>
             </w:r>
           </w:p>
         </w:tc>
@@ -4300,7 +4773,7 @@
                 <w:sz w:val="19"/>
                 <w:szCs w:val="19"/>
               </w:rPr>
-              <w:t xml:space="preserve">Crear un submenú</w:t>
+              <w:t xml:space="preserve">Ocultar y reordenar bloques</w:t>
             </w:r>
           </w:p>
         </w:tc>
@@ -4332,7 +4805,7 @@
                 <w:sz w:val="19"/>
                 <w:szCs w:val="19"/>
               </w:rPr>
-              <w:t xml:space="preserve">Aparece dentro del padre en la web</w:t>
+              <w:t xml:space="preserve">Cambia el orden en la web</w:t>
             </w:r>
           </w:p>
         </w:tc>
@@ -4405,7 +4878,7 @@
                 <w:sz w:val="19"/>
                 <w:szCs w:val="19"/>
               </w:rPr>
-              <w:t xml:space="preserve">Cambiar colores y guardar</w:t>
+              <w:t xml:space="preserve">Crear un submenú</w:t>
             </w:r>
           </w:p>
         </w:tc>
@@ -4437,7 +4910,7 @@
                 <w:sz w:val="19"/>
                 <w:szCs w:val="19"/>
               </w:rPr>
-              <w:t xml:space="preserve">La web usa los nuevos colores</w:t>
+              <w:t xml:space="preserve">Aparece dentro del padre en la web</w:t>
             </w:r>
           </w:p>
         </w:tc>
@@ -4510,7 +4983,7 @@
                 <w:sz w:val="19"/>
                 <w:szCs w:val="19"/>
               </w:rPr>
-              <w:t xml:space="preserve">Panel a 375 px de ancho</w:t>
+              <w:t xml:space="preserve">Cambiar colores y guardar</w:t>
             </w:r>
           </w:p>
         </w:tc>
@@ -4542,7 +5015,7 @@
                 <w:sz w:val="19"/>
                 <w:szCs w:val="19"/>
               </w:rPr>
-              <w:t xml:space="preserve">Menú colapsado, sin desborde</w:t>
+              <w:t xml:space="preserve">La web usa los nuevos colores</w:t>
             </w:r>
           </w:p>
         </w:tc>
@@ -4615,7 +5088,7 @@
                 <w:sz w:val="19"/>
                 <w:szCs w:val="19"/>
               </w:rPr>
-              <w:t xml:space="preserve">Consola del navegador</w:t>
+              <w:t xml:space="preserve">Panel a 375 px de ancho</w:t>
             </w:r>
           </w:p>
         </w:tc>
@@ -4647,7 +5120,7 @@
                 <w:sz w:val="19"/>
                 <w:szCs w:val="19"/>
               </w:rPr>
-              <w:t xml:space="preserve">Sin errores de JavaScript</w:t>
+              <w:t xml:space="preserve">Menú colapsado, sin desborde</w:t>
             </w:r>
           </w:p>
         </w:tc>
@@ -4661,6 +5134,111 @@
               <w:right w:val="none" w:color="FFFFFF" w:sz="0"/>
             </w:tcBorders>
             <w:shd w:fill="FFFFFF" w:val="clear"/>
+            <w:tcMar>
+              <w:top w:type="dxa" w:w="90"/>
+              <w:left w:type="dxa" w:w="140"/>
+              <w:bottom w:type="dxa" w:w="90"/>
+              <w:right w:type="dxa" w:w="140"/>
+            </w:tcMar>
+          </w:tcPr>
+          <w:p>
+            <w:pPr>
+              <w:spacing w:after="0" w:line="270"/>
+            </w:pPr>
+            <w:r>
+              <w:rPr>
+                <w:rFonts w:ascii="Arial" w:cs="Arial" w:eastAsia="Arial" w:hAnsi="Arial"/>
+                <w:b/>
+                <w:bCs/>
+                <w:color w:val="15803D"/>
+                <w:sz w:val="19"/>
+                <w:szCs w:val="19"/>
+              </w:rPr>
+              <w:t xml:space="preserve">✔ Correcto</w:t>
+            </w:r>
+          </w:p>
+        </w:tc>
+      </w:tr>
+      <w:tr>
+        <w:trPr>
+          <w:cantSplit/>
+        </w:trPr>
+        <w:tc>
+          <w:tcPr>
+            <w:tcW w:type="dxa" w:w="3600"/>
+            <w:tcBorders>
+              <w:top w:val="none" w:color="FFFFFF" w:sz="0"/>
+              <w:left w:val="none" w:color="FFFFFF" w:sz="0"/>
+              <w:bottom w:val="single" w:color="DCD3F5" w:sz="4"/>
+              <w:right w:val="none" w:color="FFFFFF" w:sz="0"/>
+            </w:tcBorders>
+            <w:shd w:fill="FAF8FF" w:val="clear"/>
+            <w:tcMar>
+              <w:top w:type="dxa" w:w="90"/>
+              <w:left w:type="dxa" w:w="140"/>
+              <w:bottom w:type="dxa" w:w="90"/>
+              <w:right w:type="dxa" w:w="140"/>
+            </w:tcMar>
+          </w:tcPr>
+          <w:p>
+            <w:pPr>
+              <w:spacing w:after="0" w:line="270"/>
+            </w:pPr>
+            <w:r>
+              <w:rPr>
+                <w:rFonts w:ascii="Arial" w:cs="Arial" w:eastAsia="Arial" w:hAnsi="Arial"/>
+                <w:b/>
+                <w:bCs/>
+                <w:color w:val="13111C"/>
+                <w:sz w:val="19"/>
+                <w:szCs w:val="19"/>
+              </w:rPr>
+              <w:t xml:space="preserve">Consola del navegador</w:t>
+            </w:r>
+          </w:p>
+        </w:tc>
+        <w:tc>
+          <w:tcPr>
+            <w:tcW w:type="dxa" w:w="4038"/>
+            <w:tcBorders>
+              <w:top w:val="none" w:color="FFFFFF" w:sz="0"/>
+              <w:left w:val="none" w:color="FFFFFF" w:sz="0"/>
+              <w:bottom w:val="single" w:color="DCD3F5" w:sz="4"/>
+              <w:right w:val="none" w:color="FFFFFF" w:sz="0"/>
+            </w:tcBorders>
+            <w:shd w:fill="FAF8FF" w:val="clear"/>
+            <w:tcMar>
+              <w:top w:type="dxa" w:w="90"/>
+              <w:left w:type="dxa" w:w="140"/>
+              <w:bottom w:type="dxa" w:w="90"/>
+              <w:right w:type="dxa" w:w="140"/>
+            </w:tcMar>
+          </w:tcPr>
+          <w:p>
+            <w:pPr>
+              <w:spacing w:after="0" w:line="270"/>
+            </w:pPr>
+            <w:r>
+              <w:rPr>
+                <w:rFonts w:ascii="Arial" w:cs="Arial" w:eastAsia="Arial" w:hAnsi="Arial"/>
+                <w:color w:val="26232F"/>
+                <w:sz w:val="19"/>
+                <w:szCs w:val="19"/>
+              </w:rPr>
+              <w:t xml:space="preserve">Sin errores de JavaScript</w:t>
+            </w:r>
+          </w:p>
+        </w:tc>
+        <w:tc>
+          <w:tcPr>
+            <w:tcW w:type="dxa" w:w="2000"/>
+            <w:tcBorders>
+              <w:top w:val="none" w:color="FFFFFF" w:sz="0"/>
+              <w:left w:val="none" w:color="FFFFFF" w:sz="0"/>
+              <w:bottom w:val="single" w:color="DCD3F5" w:sz="4"/>
+              <w:right w:val="none" w:color="FFFFFF" w:sz="0"/>
+            </w:tcBorders>
+            <w:shd w:fill="FAF8FF" w:val="clear"/>
             <w:tcMar>
               <w:top w:type="dxa" w:w="90"/>
               <w:left w:type="dxa" w:w="140"/>
@@ -5172,7 +5750,7 @@
                 <w:sz w:val="19"/>
                 <w:szCs w:val="19"/>
               </w:rPr>
-              <w:t xml:space="preserve">Escribir JSON a mano es difícil para un usuario normal.</w:t>
+              <w:t xml:space="preserve">Al agregar la descripción de cada bloque en la lista, en el celular la fila se salía de la pantalla.</w:t>
             </w:r>
           </w:p>
         </w:tc>
@@ -5186,6 +5764,94 @@
               <w:right w:val="none" w:color="FFFFFF" w:sz="0"/>
             </w:tcBorders>
             <w:shd w:fill="FFFFFF" w:val="clear"/>
+            <w:tcMar>
+              <w:top w:type="dxa" w:w="90"/>
+              <w:left w:type="dxa" w:w="140"/>
+              <w:bottom w:type="dxa" w:w="90"/>
+              <w:right w:type="dxa" w:w="140"/>
+            </w:tcMar>
+          </w:tcPr>
+          <w:p>
+            <w:pPr>
+              <w:spacing w:after="0" w:line="270"/>
+            </w:pPr>
+            <w:r>
+              <w:rPr>
+                <w:rFonts w:ascii="Arial" w:cs="Arial" w:eastAsia="Arial" w:hAnsi="Arial"/>
+                <w:color w:val="26232F"/>
+                <w:sz w:val="19"/>
+                <w:szCs w:val="19"/>
+              </w:rPr>
+              <w:t xml:space="preserve">La lista usa </w:t>
+            </w:r>
+            <w:r>
+              <w:rPr>
+                <w:rFonts w:ascii="Consolas" w:cs="Consolas" w:eastAsia="Consolas" w:hAnsi="Consolas"/>
+                <w:color w:val="26232F"/>
+                <w:sz w:val="19"/>
+                <w:szCs w:val="19"/>
+                <w:shd w:fill="F3EEFF" w:val="clear"/>
+              </w:rPr>
+              <w:t xml:space="preserve">grid-template-columns: minmax(0, 1fr)</w:t>
+            </w:r>
+            <w:r>
+              <w:rPr>
+                <w:rFonts w:ascii="Arial" w:cs="Arial" w:eastAsia="Arial" w:hAnsi="Arial"/>
+                <w:color w:val="26232F"/>
+                <w:sz w:val="19"/>
+                <w:szCs w:val="19"/>
+              </w:rPr>
+              <w:t xml:space="preserve"> para que el texto largo se corte con “…” en vez de empujar el ancho.</w:t>
+            </w:r>
+          </w:p>
+        </w:tc>
+      </w:tr>
+      <w:tr>
+        <w:trPr>
+          <w:cantSplit/>
+        </w:trPr>
+        <w:tc>
+          <w:tcPr>
+            <w:tcW w:type="dxa" w:w="4300"/>
+            <w:tcBorders>
+              <w:top w:val="none" w:color="FFFFFF" w:sz="0"/>
+              <w:left w:val="none" w:color="FFFFFF" w:sz="0"/>
+              <w:bottom w:val="single" w:color="DCD3F5" w:sz="4"/>
+              <w:right w:val="none" w:color="FFFFFF" w:sz="0"/>
+            </w:tcBorders>
+            <w:shd w:fill="FAF8FF" w:val="clear"/>
+            <w:tcMar>
+              <w:top w:type="dxa" w:w="90"/>
+              <w:left w:type="dxa" w:w="140"/>
+              <w:bottom w:type="dxa" w:w="90"/>
+              <w:right w:type="dxa" w:w="140"/>
+            </w:tcMar>
+          </w:tcPr>
+          <w:p>
+            <w:pPr>
+              <w:spacing w:after="0" w:line="270"/>
+            </w:pPr>
+            <w:r>
+              <w:rPr>
+                <w:rFonts w:ascii="Arial" w:cs="Arial" w:eastAsia="Arial" w:hAnsi="Arial"/>
+                <w:color w:val="26232F"/>
+                <w:sz w:val="19"/>
+                <w:szCs w:val="19"/>
+              </w:rPr>
+              <w:t xml:space="preserve">Escribir JSON a mano es difícil para un usuario normal.</w:t>
+            </w:r>
+          </w:p>
+        </w:tc>
+        <w:tc>
+          <w:tcPr>
+            <w:tcW w:type="dxa" w:w="5338"/>
+            <w:tcBorders>
+              <w:top w:val="none" w:color="FFFFFF" w:sz="0"/>
+              <w:left w:val="none" w:color="FFFFFF" w:sz="0"/>
+              <w:bottom w:val="single" w:color="DCD3F5" w:sz="4"/>
+              <w:right w:val="none" w:color="FFFFFF" w:sz="0"/>
+            </w:tcBorders>
+            <w:shd w:fill="FAF8FF" w:val="clear"/>
             <w:tcMar>
               <w:top w:type="dxa" w:w="90"/>
               <w:left w:type="dxa" w:w="140"/>

</xml_diff>